<commit_message>
Add execution-file section and urgent relief to rent clarification request
Co-Authored-By: Claude Opus 5.5 <noreply@anthropic.com>
Claude-Session: https://claude.ai/code/session_01Nr8GbKThPagdJhc29mLGFq
</commit_message>
<xml_diff>
--- a/בקשה להבהרת מועד תחילת חיוב - דמי שכירות.docx
+++ b/בקשה להבהרת מועד תחילת חיוב - דמי שכירות.docx
@@ -52,7 +52,7 @@
           <w:bCs/>
           <w:szCs w:val="24"/>
         </w:rPr>
-        <w:t>תיק: 739403/7</w:t>
+        <w:t>תיקים: 739403/7; 739402/8</w:t>
       </w:r>
     </w:p>
     <w:p>
@@ -267,6 +267,24 @@
     <w:p>
       <w:pPr>
         <w:bidi/>
+        <w:spacing w:after="80" w:before="0" w:line="240" w:lineRule="auto"/>
+        <w:jc w:val="center"/>
+      </w:pPr>
+      <w:r>
+        <w:rPr>
+          <w:b/>
+          <w:sz w:val="32"/>
+          <w:u w:val="single"/>
+          <w:rtl/>
+          <w:bCs/>
+          <w:szCs w:val="32"/>
+        </w:rPr>
+        <w:t>בקשה דחופה להבהרת מועד תחילת חיוב המבקש בתשלום דמי שכירות</w:t>
+      </w:r>
+    </w:p>
+    <w:p>
+      <w:pPr>
+        <w:bidi/>
         <w:spacing w:after="360" w:before="0" w:line="240" w:lineRule="auto"/>
         <w:jc w:val="center"/>
       </w:pPr>
@@ -279,7 +297,7 @@
           <w:bCs/>
           <w:szCs w:val="32"/>
         </w:rPr>
-        <w:t>בקשה להבהרת מועד תחילת חיוב המבקש בתשלום דמי שכירות</w:t>
+        <w:t>ולעיכוב הליכי הוצאה לפועל</w:t>
       </w:r>
     </w:p>
     <w:p>
@@ -296,7 +314,7 @@
           <w:rtl/>
           <w:szCs w:val="24"/>
         </w:rPr>
-        <w:t>בית הדין הנכבד מתבקש בזאת להבהיר את מועד תחילת החיוב שהוטל על המבקש בתשלום דמי שכירות, כמפורט להלן:</w:t>
+        <w:t>בית הדין הנכבד מתבקש בזאת להבהיר את מועד תחילת החיוב שהוטל על המבקש בתשלום דמי שכירות, ולהורות על עיכוב הליכי ההוצאה לפועל שנפתחו נגדו, כמפורט להלן:</w:t>
       </w:r>
     </w:p>
     <w:p>
@@ -551,7 +569,133 @@
           <w:rtl/>
           <w:szCs w:val="24"/>
         </w:rPr>
-        <w:t>, התקבלה אצל המבקש, במפתיע, הודעה מלשכת ההוצאה לפועל, שלפיה פתחה התובעת תיק הוצאה לפועל נגדו לגביית דמי שכירות.</w:t>
+        <w:t xml:space="preserve">, התקבלה אצל המבקש, במפתיע, אזהרה מלשכת ההוצאה לפועל, שלפיה פתחה התובעת נגדו ביום </w:t>
+      </w:r>
+      <w:r>
+        <w:rPr>
+          <w:b/>
+          <w:sz w:val="24"/>
+          <w:u w:val="none"/>
+          <w:rtl/>
+          <w:bCs/>
+          <w:szCs w:val="24"/>
+        </w:rPr>
+        <w:t>5.7.2026</w:t>
+      </w:r>
+      <w:r>
+        <w:rPr>
+          <w:b w:val="0"/>
+          <w:sz w:val="24"/>
+          <w:u w:val="none"/>
+          <w:rtl/>
+          <w:szCs w:val="24"/>
+        </w:rPr>
+        <w:t xml:space="preserve"> תיק הוצאה לפועל מס' </w:t>
+      </w:r>
+      <w:r>
+        <w:rPr>
+          <w:b/>
+          <w:sz w:val="24"/>
+          <w:u w:val="none"/>
+          <w:rtl/>
+          <w:bCs/>
+          <w:szCs w:val="24"/>
+        </w:rPr>
+        <w:t>504656-07-26</w:t>
+      </w:r>
+      <w:r>
+        <w:rPr>
+          <w:b w:val="0"/>
+          <w:sz w:val="24"/>
+          <w:u w:val="none"/>
+          <w:rtl/>
+          <w:szCs w:val="24"/>
+        </w:rPr>
+        <w:t xml:space="preserve">, מסוג "מזונות", לגביית סך כולל של </w:t>
+      </w:r>
+      <w:r>
+        <w:rPr>
+          <w:b/>
+          <w:sz w:val="24"/>
+          <w:u w:val="none"/>
+          <w:rtl/>
+          <w:bCs/>
+          <w:szCs w:val="24"/>
+        </w:rPr>
+        <w:t>20,615.70 ש"ח</w:t>
+      </w:r>
+      <w:r>
+        <w:rPr>
+          <w:b w:val="0"/>
+          <w:sz w:val="24"/>
+          <w:u w:val="none"/>
+          <w:rtl/>
+          <w:szCs w:val="24"/>
+        </w:rPr>
+        <w:t xml:space="preserve">. התיק נפתח על יסוד פסק הדין שניתן ביום </w:t>
+      </w:r>
+      <w:r>
+        <w:rPr>
+          <w:b/>
+          <w:sz w:val="24"/>
+          <w:u w:val="none"/>
+          <w:rtl/>
+          <w:bCs/>
+          <w:szCs w:val="24"/>
+        </w:rPr>
+        <w:t>12.2.2026</w:t>
+      </w:r>
+      <w:r>
+        <w:rPr>
+          <w:b w:val="0"/>
+          <w:sz w:val="24"/>
+          <w:u w:val="none"/>
+          <w:rtl/>
+          <w:szCs w:val="24"/>
+        </w:rPr>
+        <w:t xml:space="preserve"> בתיק </w:t>
+      </w:r>
+      <w:r>
+        <w:rPr>
+          <w:b/>
+          <w:sz w:val="24"/>
+          <w:u w:val="none"/>
+          <w:rtl/>
+          <w:bCs/>
+          <w:szCs w:val="24"/>
+        </w:rPr>
+        <w:t>739402/8</w:t>
+      </w:r>
+      <w:r>
+        <w:rPr>
+          <w:b w:val="0"/>
+          <w:sz w:val="24"/>
+          <w:u w:val="none"/>
+          <w:rtl/>
+          <w:szCs w:val="24"/>
+        </w:rPr>
+        <w:t xml:space="preserve">. העתק האזהרה ושובר התשלום מצ"ב ומסומנים </w:t>
+      </w:r>
+      <w:r>
+        <w:rPr>
+          <w:b/>
+          <w:sz w:val="24"/>
+          <w:u w:val="none"/>
+          <w:rtl/>
+          <w:bCs/>
+          <w:szCs w:val="24"/>
+        </w:rPr>
+        <w:t>נספח א'</w:t>
+      </w:r>
+      <w:r>
+        <w:rPr>
+          <w:b w:val="0"/>
+          <w:sz w:val="24"/>
+          <w:u w:val="none"/>
+          <w:rtl/>
+          <w:szCs w:val="24"/>
+        </w:rPr>
+        <w:t>.</w:t>
       </w:r>
     </w:p>
     <w:p>
@@ -583,7 +727,7 @@
           <w:rtl/>
           <w:szCs w:val="24"/>
         </w:rPr>
-        <w:t xml:space="preserve">פתיחת התיק כאמור תמוהה ואינה מוצדקת, שכן המבקש משלם לתובעת, מדי חודש בחודשו וממועד ההחלטה, סך של </w:t>
+        <w:t xml:space="preserve">התובעת טוענת, במסגרת תיק ההוצאה לפועל, כי לא קיבלה את דמי המדור. טענה זו אינה נכונה. פסק הדין מיום 12.2.2026 חייב את המבקש בתשלום סך של </w:t>
       </w:r>
       <w:r>
         <w:rPr>
@@ -594,7 +738,7 @@
           <w:bCs/>
           <w:szCs w:val="24"/>
         </w:rPr>
-        <w:t>5,450 ש"ח</w:t>
+        <w:t>5,450 ש"ח</w:t>
       </w:r>
       <w:r>
         <w:rPr>
@@ -604,7 +748,7 @@
           <w:rtl/>
           <w:szCs w:val="24"/>
         </w:rPr>
-        <w:t>, הכולל בתוכו את דמי השכירות. בנסיבות אלה, פנייה להליכי הוצאה לפועל בגין חיוב המשולם בפועל, ובטרם הובהר כלל מועד תחילת החיוב, עולה כדי שימוש לרעה בהליכי הוצאה לפועל וחוסר תום לב, ונועדה אך להכביד על המבקש שלא לצורך.</w:t>
+        <w:t xml:space="preserve"> לחודש, הכולל את המדור, והמבקש משלם סכום זה לתובעת במלואו, מדי חודש בחודשו, ממועד ההחלטה. משכך, אין בפסק הדין שעל יסודו נפתח התיק כל בסיס לחוב הנטען.</w:t>
       </w:r>
     </w:p>
     <w:p>
@@ -636,7 +780,389 @@
           <w:rtl/>
           <w:szCs w:val="24"/>
         </w:rPr>
-        <w:t>אשר על כן, מתבקש בית הדין הנכבד להבהיר את מועד תחילת חיובו של המבקש בתשלום 40% מדמי השכירות כאמור, ולקבוע מועד זה במפורש - הבהרה הנדרשת ביתר שאת נוכח הליכי ההוצאה לפועל שנפתחו כאמור.</w:t>
+        <w:t>יתרה מכך, בית הדין הנכבד מעולם לא חייב את המבקש בתשלום מדור או דמי שכירות באופן רטרואקטיבי, לא בפסק הדין מיום 12.2.2026 ולא בדיון מיום 22.6.2026. ממילא, לא ניתן לגבות למפרע חיוב שבית הדין לא קבע את מועד תחילתו.</w:t>
+      </w:r>
+    </w:p>
+    <w:p>
+      <w:pPr>
+        <w:tabs>
+          <w:tab w:pos="425" w:val="left"/>
+        </w:tabs>
+        <w:bidi/>
+        <w:spacing w:after="200" w:before="0" w:line="360" w:lineRule="auto"/>
+        <w:ind w:right="425" w:hanging="425"/>
+        <w:jc w:val="both"/>
+      </w:pPr>
+      <w:r>
+        <w:rPr>
+          <w:b w:val="0"/>
+          <w:sz w:val="24"/>
+          <w:u w:val="none"/>
+          <w:rtl/>
+          <w:szCs w:val="24"/>
+        </w:rPr>
+        <w:t>9.</w:t>
+        <w:tab/>
+      </w:r>
+      <w:r>
+        <w:rPr>
+          <w:b w:val="0"/>
+          <w:sz w:val="24"/>
+          <w:u w:val="none"/>
+          <w:rtl/>
+          <w:szCs w:val="24"/>
+        </w:rPr>
+        <w:t xml:space="preserve">הסכום הנגבה מלמד בעצמו כי מדובר בגבייה רטרואקטיבית. כעולה מדפי חשבון הבנק של התובעת, דמי השכירות החודשיים שהיא משלמת בהוראת קבע עומדים על </w:t>
+      </w:r>
+      <w:r>
+        <w:rPr>
+          <w:b/>
+          <w:sz w:val="24"/>
+          <w:u w:val="none"/>
+          <w:rtl/>
+          <w:bCs/>
+          <w:szCs w:val="24"/>
+        </w:rPr>
+        <w:t>3,700 ש"ח</w:t>
+      </w:r>
+      <w:r>
+        <w:rPr>
+          <w:b w:val="0"/>
+          <w:sz w:val="24"/>
+          <w:u w:val="none"/>
+          <w:rtl/>
+          <w:szCs w:val="24"/>
+        </w:rPr>
+        <w:t xml:space="preserve">. 40% מסכום זה הם </w:t>
+      </w:r>
+      <w:r>
+        <w:rPr>
+          <w:b/>
+          <w:sz w:val="24"/>
+          <w:u w:val="none"/>
+          <w:rtl/>
+          <w:bCs/>
+          <w:szCs w:val="24"/>
+        </w:rPr>
+        <w:t>1,480 ש"ח</w:t>
+      </w:r>
+      <w:r>
+        <w:rPr>
+          <w:b w:val="0"/>
+          <w:sz w:val="24"/>
+          <w:u w:val="none"/>
+          <w:rtl/>
+          <w:szCs w:val="24"/>
+        </w:rPr>
+        <w:t xml:space="preserve"> לחודש, והחוב הנקוב בשובר התשלום, </w:t>
+      </w:r>
+      <w:r>
+        <w:rPr>
+          <w:b/>
+          <w:sz w:val="24"/>
+          <w:u w:val="none"/>
+          <w:rtl/>
+          <w:bCs/>
+          <w:szCs w:val="24"/>
+        </w:rPr>
+        <w:t>7,400 ש"ח</w:t>
+      </w:r>
+      <w:r>
+        <w:rPr>
+          <w:b w:val="0"/>
+          <w:sz w:val="24"/>
+          <w:u w:val="none"/>
+          <w:rtl/>
+          <w:szCs w:val="24"/>
+        </w:rPr>
+        <w:t xml:space="preserve">, שווה בדיוק ל-40% מדמי השכירות עבור חמישה חודשים. כלומר, התובעת מחשבת את החיוב למפרע, לתקופה שקדמה לדיון מיום 22.6.2026, שבו נקבע לראשונה שיעור ה-40%. דפי החשבון מצ"ב ומסומנים </w:t>
+      </w:r>
+      <w:r>
+        <w:rPr>
+          <w:b/>
+          <w:sz w:val="24"/>
+          <w:u w:val="none"/>
+          <w:rtl/>
+          <w:bCs/>
+          <w:szCs w:val="24"/>
+        </w:rPr>
+        <w:t>נספח ב'</w:t>
+      </w:r>
+      <w:r>
+        <w:rPr>
+          <w:b w:val="0"/>
+          <w:sz w:val="24"/>
+          <w:u w:val="none"/>
+          <w:rtl/>
+          <w:szCs w:val="24"/>
+        </w:rPr>
+        <w:t>.</w:t>
+      </w:r>
+    </w:p>
+    <w:p>
+      <w:pPr>
+        <w:tabs>
+          <w:tab w:pos="425" w:val="left"/>
+        </w:tabs>
+        <w:bidi/>
+        <w:spacing w:after="200" w:before="0" w:line="360" w:lineRule="auto"/>
+        <w:ind w:right="425" w:hanging="425"/>
+        <w:jc w:val="both"/>
+      </w:pPr>
+      <w:r>
+        <w:rPr>
+          <w:b w:val="0"/>
+          <w:sz w:val="24"/>
+          <w:u w:val="none"/>
+          <w:rtl/>
+          <w:szCs w:val="24"/>
+        </w:rPr>
+        <w:t>10.</w:t>
+        <w:tab/>
+      </w:r>
+      <w:r>
+        <w:rPr>
+          <w:b w:val="0"/>
+          <w:sz w:val="24"/>
+          <w:u w:val="none"/>
+          <w:rtl/>
+          <w:szCs w:val="24"/>
+        </w:rPr>
+        <w:t xml:space="preserve">זאת ועוד, מסמכי התיק סותרים זה את זה: באזהרה נקוב חוב ביום פתיחת התיק בסך </w:t>
+      </w:r>
+      <w:r>
+        <w:rPr>
+          <w:b/>
+          <w:sz w:val="24"/>
+          <w:u w:val="none"/>
+          <w:rtl/>
+          <w:bCs/>
+          <w:szCs w:val="24"/>
+        </w:rPr>
+        <w:t>20,535.61 ש"ח</w:t>
+      </w:r>
+      <w:r>
+        <w:rPr>
+          <w:b w:val="0"/>
+          <w:sz w:val="24"/>
+          <w:u w:val="none"/>
+          <w:rtl/>
+          <w:szCs w:val="24"/>
+        </w:rPr>
+        <w:t xml:space="preserve">, ואילו בשובר התשלום נקוב חוב ביום פתיחת התיק בסך </w:t>
+      </w:r>
+      <w:r>
+        <w:rPr>
+          <w:b/>
+          <w:sz w:val="24"/>
+          <w:u w:val="none"/>
+          <w:rtl/>
+          <w:bCs/>
+          <w:szCs w:val="24"/>
+        </w:rPr>
+        <w:t>7,400 ש"ח</w:t>
+      </w:r>
+      <w:r>
+        <w:rPr>
+          <w:b w:val="0"/>
+          <w:sz w:val="24"/>
+          <w:u w:val="none"/>
+          <w:rtl/>
+          <w:szCs w:val="24"/>
+        </w:rPr>
+        <w:t xml:space="preserve"> בלבד, ובשניהם נקוב אותו סכום כולל לתשלום. לפער זה אין כל הסבר, והוא מעיד אף הוא על היעדר בסיס לחוב הנטען.</w:t>
+      </w:r>
+    </w:p>
+    <w:p>
+      <w:pPr>
+        <w:tabs>
+          <w:tab w:pos="425" w:val="left"/>
+        </w:tabs>
+        <w:bidi/>
+        <w:spacing w:after="200" w:before="0" w:line="360" w:lineRule="auto"/>
+        <w:ind w:right="425" w:hanging="425"/>
+        <w:jc w:val="both"/>
+      </w:pPr>
+      <w:r>
+        <w:rPr>
+          <w:b w:val="0"/>
+          <w:sz w:val="24"/>
+          <w:u w:val="none"/>
+          <w:rtl/>
+          <w:szCs w:val="24"/>
+        </w:rPr>
+        <w:t>11.</w:t>
+        <w:tab/>
+      </w:r>
+      <w:r>
+        <w:rPr>
+          <w:b w:val="0"/>
+          <w:sz w:val="24"/>
+          <w:u w:val="none"/>
+          <w:rtl/>
+          <w:szCs w:val="24"/>
+        </w:rPr>
+        <w:t>בנסיבות אלה, פנייה להליכי הוצאה לפועל בגין חיוב המשולם בפועל, ובטרם הובהר כלל מועד תחילת החיוב, עולה כדי שימוש לרעה בהליכי הוצאה לפועל וחוסר תום לב, ונועדה אך להכביד על המבקש שלא לצורך. התיק מטריד את מנוחתו של המבקש וחושף אותו להליכי גבייה בתוך 20 ימים מקבלת האזהרה, ומכאן דחיפות הבקשה.</w:t>
+      </w:r>
+    </w:p>
+    <w:p>
+      <w:pPr>
+        <w:tabs>
+          <w:tab w:pos="425" w:val="left"/>
+        </w:tabs>
+        <w:bidi/>
+        <w:spacing w:after="200" w:before="0" w:line="360" w:lineRule="auto"/>
+        <w:ind w:right="425" w:hanging="425"/>
+        <w:jc w:val="both"/>
+      </w:pPr>
+      <w:r>
+        <w:rPr>
+          <w:b w:val="0"/>
+          <w:sz w:val="24"/>
+          <w:u w:val="none"/>
+          <w:rtl/>
+          <w:szCs w:val="24"/>
+        </w:rPr>
+        <w:t>12.</w:t>
+        <w:tab/>
+      </w:r>
+      <w:r>
+        <w:rPr>
+          <w:b w:val="0"/>
+          <w:sz w:val="24"/>
+          <w:u w:val="none"/>
+          <w:rtl/>
+          <w:szCs w:val="24"/>
+        </w:rPr>
+        <w:t>אשר על כן, מתבקש בית הדין הנכבד ליתן החלטה בהקדם, כדלקמן:</w:t>
+      </w:r>
+    </w:p>
+    <w:p>
+      <w:pPr>
+        <w:tabs>
+          <w:tab w:pos="850" w:val="left"/>
+        </w:tabs>
+        <w:bidi/>
+        <w:spacing w:after="120" w:before="0" w:line="360" w:lineRule="auto"/>
+        <w:ind w:right="850" w:hanging="425"/>
+        <w:jc w:val="both"/>
+      </w:pPr>
+      <w:r>
+        <w:rPr>
+          <w:b w:val="0"/>
+          <w:sz w:val="24"/>
+          <w:u w:val="none"/>
+          <w:rtl/>
+          <w:szCs w:val="24"/>
+        </w:rPr>
+        <w:t>א.</w:t>
+        <w:tab/>
+      </w:r>
+      <w:r>
+        <w:rPr>
+          <w:b w:val="0"/>
+          <w:sz w:val="24"/>
+          <w:u w:val="none"/>
+          <w:rtl/>
+          <w:szCs w:val="24"/>
+        </w:rPr>
+        <w:t>להבהיר את מועד תחילת חיובו של המבקש בתשלום 40% מדמי השכירות, ולקבוע במפורש כי חיוב זה אינו חל רטרואקטיבית, לתקופה שקדמה לדיון מיום 22.6.2026.</w:t>
+      </w:r>
+    </w:p>
+    <w:p>
+      <w:pPr>
+        <w:tabs>
+          <w:tab w:pos="850" w:val="left"/>
+        </w:tabs>
+        <w:bidi/>
+        <w:spacing w:after="120" w:before="0" w:line="360" w:lineRule="auto"/>
+        <w:ind w:right="850" w:hanging="425"/>
+        <w:jc w:val="both"/>
+      </w:pPr>
+      <w:r>
+        <w:rPr>
+          <w:b w:val="0"/>
+          <w:sz w:val="24"/>
+          <w:u w:val="none"/>
+          <w:rtl/>
+          <w:szCs w:val="24"/>
+        </w:rPr>
+        <w:t>ב.</w:t>
+        <w:tab/>
+      </w:r>
+      <w:r>
+        <w:rPr>
+          <w:b w:val="0"/>
+          <w:sz w:val="24"/>
+          <w:u w:val="none"/>
+          <w:rtl/>
+          <w:szCs w:val="24"/>
+        </w:rPr>
+        <w:t>להצהיר כי המבקש אינו חב לתובעת כל חוב בגין מדור לפי פסק הדין מיום 12.2.2026, שכן הסכום שנפסק, 5,450 ש"ח לחודש הכולל מדור, משולם במלואו.</w:t>
+      </w:r>
+    </w:p>
+    <w:p>
+      <w:pPr>
+        <w:tabs>
+          <w:tab w:pos="850" w:val="left"/>
+        </w:tabs>
+        <w:bidi/>
+        <w:spacing w:after="120" w:before="0" w:line="360" w:lineRule="auto"/>
+        <w:ind w:right="850" w:hanging="425"/>
+        <w:jc w:val="both"/>
+      </w:pPr>
+      <w:r>
+        <w:rPr>
+          <w:b w:val="0"/>
+          <w:sz w:val="24"/>
+          <w:u w:val="none"/>
+          <w:rtl/>
+          <w:szCs w:val="24"/>
+        </w:rPr>
+        <w:t>ג.</w:t>
+        <w:tab/>
+      </w:r>
+      <w:r>
+        <w:rPr>
+          <w:b w:val="0"/>
+          <w:sz w:val="24"/>
+          <w:u w:val="none"/>
+          <w:rtl/>
+          <w:szCs w:val="24"/>
+        </w:rPr>
+        <w:t>להורות על עיכוב הליכי הגבייה בתיק ההוצאה לפועל מס' 504656-07-26 עד להכרעה בבקשה זו.</w:t>
+      </w:r>
+    </w:p>
+    <w:p>
+      <w:pPr>
+        <w:tabs>
+          <w:tab w:pos="850" w:val="left"/>
+        </w:tabs>
+        <w:bidi/>
+        <w:spacing w:after="120" w:before="0" w:line="360" w:lineRule="auto"/>
+        <w:ind w:right="850" w:hanging="425"/>
+        <w:jc w:val="both"/>
+      </w:pPr>
+      <w:r>
+        <w:rPr>
+          <w:b w:val="0"/>
+          <w:sz w:val="24"/>
+          <w:u w:val="none"/>
+          <w:rtl/>
+          <w:szCs w:val="24"/>
+        </w:rPr>
+        <w:t>ד.</w:t>
+        <w:tab/>
+      </w:r>
+      <w:r>
+        <w:rPr>
+          <w:b w:val="0"/>
+          <w:sz w:val="24"/>
+          <w:u w:val="none"/>
+          <w:rtl/>
+          <w:szCs w:val="24"/>
+        </w:rPr>
+        <w:t>להורות לתובעת לפעול לסגירת תיק ההוצאה לפועל, ולחלופין לקבוע כי פסקי הדין בתיקים שבכותרת אינם מהווים בסיס לגביית הסכום הנתבע בתיק.</w:t>
       </w:r>
     </w:p>
     <w:p>

</xml_diff>

<commit_message>
Clarify that the 40% rent share is included in the 5,450 payment
Co-Authored-By: Claude Opus 5.5 <noreply@anthropic.com>
Claude-Session: https://claude.ai/code/session_01Nr8GbKThPagdJhc29mLGFq
</commit_message>
<xml_diff>
--- a/בקשה להבהרת מועד תחילת חיוב - דמי שכירות.docx
+++ b/בקשה להבהרת מועד תחילת חיוב - דמי שכירות.docx
@@ -748,7 +748,7 @@
           <w:rtl/>
           <w:szCs w:val="24"/>
         </w:rPr>
-        <w:t xml:space="preserve"> לחודש, הכולל את המדור, והמבקש משלם סכום זה לתובעת במלואו, מדי חודש בחודשו, ממועד ההחלטה. משכך, אין בפסק הדין שעל יסודו נפתח התיק כל בסיס לחוב הנטען.</w:t>
+        <w:t xml:space="preserve"> לחודש, הכולל את המדור, והמבקש משלם סכום זה לתובעת במלואו, מדי חודש בחודשו, ממועד ההחלטה. יובהר, כי החיוב בתשלום 40% מדמי השכירות, שנקבע בדיון מיום 22.6.2026, אינו תוספת על סכום זה, אלא חלק ממנו, שכן רכיב המדור כלול בסך של 5,450 ש"ח. משכך, רכיב המדור נפרע בפועל במסגרת התשלום החודשי, ואין בפסק הדין שעל יסודו נפתח התיק כל בסיס לחוב הנטען.</w:t>
       </w:r>
     </w:p>
     <w:p>
@@ -1098,7 +1098,7 @@
           <w:rtl/>
           <w:szCs w:val="24"/>
         </w:rPr>
-        <w:t>להצהיר כי המבקש אינו חב לתובעת כל חוב בגין מדור לפי פסק הדין מיום 12.2.2026, שכן הסכום שנפסק, 5,450 ש"ח לחודש הכולל מדור, משולם במלואו.</w:t>
+        <w:t>להצהיר כי המבקש אינו חב לתובעת כל חוב בגין מדור לפי פסק הדין מיום 12.2.2026, שכן הסכום שנפסק, 5,450 ש"ח לחודש, כולל את המדור ואת חלקו של המבקש בדמי השכירות (40%), ומשולם במלואו.</w:t>
       </w:r>
     </w:p>
     <w:p>

</xml_diff>

<commit_message>
Add maintenance reduction for eldest daughter turning 18 and update filing date
Co-Authored-By: Claude Opus 5.5 <noreply@anthropic.com>
Claude-Session: https://claude.ai/code/session_01Nr8GbKThPagdJhc29mLGFq
</commit_message>
<xml_diff>
--- a/בקשה להבהרת מועד תחילת חיוב - דמי שכירות.docx
+++ b/בקשה להבהרת מועד תחילת חיוב - דמי שכירות.docx
@@ -16,7 +16,7 @@
           <w:rtl/>
           <w:szCs w:val="24"/>
         </w:rPr>
-        <w:t>27/7/26</w:t>
+        <w:t>24/9/26</w:t>
       </w:r>
     </w:p>
     <w:p>
@@ -297,7 +297,7 @@
           <w:bCs/>
           <w:szCs w:val="32"/>
         </w:rPr>
-        <w:t>ולעיכוב הליכי הוצאה לפועל</w:t>
+        <w:t>לעיכוב הליכי הוצאה לפועל ולהפחתת מזונות</w:t>
       </w:r>
     </w:p>
     <w:p>
@@ -314,7 +314,7 @@
           <w:rtl/>
           <w:szCs w:val="24"/>
         </w:rPr>
-        <w:t>בית הדין הנכבד מתבקש בזאת להבהיר את מועד תחילת החיוב שהוטל על המבקש בתשלום דמי שכירות, ולהורות על עיכוב הליכי ההוצאה לפועל שנפתחו נגדו, כמפורט להלן:</w:t>
+        <w:t>בית הדין הנכבד מתבקש בזאת להבהיר את מועד תחילת החיוב שהוטל על המבקש בתשלום דמי שכירות, להורות על עיכוב הליכי ההוצאה לפועל שנפתחו נגדו, ולהפחית את המזונות נוכח הגעת הבת הבכורה לגיל 18, כמפורט להלן:</w:t>
       </w:r>
     </w:p>
     <w:p>
@@ -548,7 +548,7 @@
           <w:rtl/>
           <w:szCs w:val="24"/>
         </w:rPr>
-        <w:t xml:space="preserve">זאת ועוד, הבוקר, ביום </w:t>
+        <w:t xml:space="preserve">זאת ועוד, ביום </w:t>
       </w:r>
       <w:r>
         <w:rPr>
@@ -1002,7 +1002,7 @@
           <w:rtl/>
           <w:szCs w:val="24"/>
         </w:rPr>
-        <w:t>בנסיבות אלה, פנייה להליכי הוצאה לפועל בגין חיוב המשולם בפועל, ובטרם הובהר כלל מועד תחילת החיוב, עולה כדי שימוש לרעה בהליכי הוצאה לפועל וחוסר תום לב, ונועדה אך להכביד על המבקש שלא לצורך. התיק מטריד את מנוחתו של המבקש וחושף אותו להליכי גבייה בתוך 20 ימים מקבלת האזהרה, ומכאן דחיפות הבקשה.</w:t>
+        <w:t>בנסיבות אלה, פנייה להליכי הוצאה לפועל בגין חיוב המשולם בפועל, ובטרם הובהר כלל מועד תחילת החיוב, עולה כדי שימוש לרעה בהליכי הוצאה לפועל וחוסר תום לב, ונועדה אך להכביד על המבקש שלא לצורך. התיק מטריד את מנוחתו של המבקש וחושף אותו להליכי גבייה בכל עת, ומכאן דחיפות הבקשה.</w:t>
       </w:r>
     </w:p>
     <w:p>
@@ -1024,6 +1024,196 @@
           <w:szCs w:val="24"/>
         </w:rPr>
         <w:t>12.</w:t>
+        <w:tab/>
+      </w:r>
+      <w:r>
+        <w:rPr>
+          <w:b w:val="0"/>
+          <w:sz w:val="24"/>
+          <w:u w:val="none"/>
+          <w:rtl/>
+          <w:szCs w:val="24"/>
+        </w:rPr>
+        <w:t xml:space="preserve">בנוסף, מתבקש בית הדין הנכבד לעדכן את גובה המזונות השוטפים. בתם הבכורה של הצדדים, ילידת </w:t>
+      </w:r>
+      <w:r>
+        <w:rPr>
+          <w:b/>
+          <w:sz w:val="24"/>
+          <w:u w:val="none"/>
+          <w:rtl/>
+          <w:bCs/>
+          <w:szCs w:val="24"/>
+        </w:rPr>
+        <w:t>1.9.2008</w:t>
+      </w:r>
+      <w:r>
+        <w:rPr>
+          <w:b w:val="0"/>
+          <w:sz w:val="24"/>
+          <w:u w:val="none"/>
+          <w:rtl/>
+          <w:szCs w:val="24"/>
+        </w:rPr>
+        <w:t xml:space="preserve">, מלאו לה 18 שנים ביום </w:t>
+      </w:r>
+      <w:r>
+        <w:rPr>
+          <w:b/>
+          <w:sz w:val="24"/>
+          <w:u w:val="none"/>
+          <w:rtl/>
+          <w:bCs/>
+          <w:szCs w:val="24"/>
+        </w:rPr>
+        <w:t>1.9.2026</w:t>
+      </w:r>
+      <w:r>
+        <w:rPr>
+          <w:b w:val="0"/>
+          <w:sz w:val="24"/>
+          <w:u w:val="none"/>
+          <w:rtl/>
+          <w:szCs w:val="24"/>
+        </w:rPr>
+        <w:t>, והיא טרם התגייסה לשירות צבאי או לאומי.</w:t>
+      </w:r>
+    </w:p>
+    <w:p>
+      <w:pPr>
+        <w:tabs>
+          <w:tab w:pos="425" w:val="left"/>
+        </w:tabs>
+        <w:bidi/>
+        <w:spacing w:after="200" w:before="0" w:line="360" w:lineRule="auto"/>
+        <w:ind w:right="425" w:hanging="425"/>
+        <w:jc w:val="both"/>
+      </w:pPr>
+      <w:r>
+        <w:rPr>
+          <w:b w:val="0"/>
+          <w:sz w:val="24"/>
+          <w:u w:val="none"/>
+          <w:rtl/>
+          <w:szCs w:val="24"/>
+        </w:rPr>
+        <w:t>13.</w:t>
+        <w:tab/>
+      </w:r>
+      <w:r>
+        <w:rPr>
+          <w:b w:val="0"/>
+          <w:sz w:val="24"/>
+          <w:u w:val="none"/>
+          <w:rtl/>
+          <w:szCs w:val="24"/>
+        </w:rPr>
+        <w:t xml:space="preserve">בהתאם לפסיקה הנוהגת, עם הגיע ילד לגיל 18 ועד תום שירותו הצבאי או הלאומי, מופחתים מזונותיו לשליש. חלקה של הבת במזונות עומד על </w:t>
+      </w:r>
+      <w:r>
+        <w:rPr>
+          <w:b/>
+          <w:sz w:val="24"/>
+          <w:u w:val="none"/>
+          <w:rtl/>
+          <w:bCs/>
+          <w:szCs w:val="24"/>
+        </w:rPr>
+        <w:t>1,200 ש"ח</w:t>
+      </w:r>
+      <w:r>
+        <w:rPr>
+          <w:b w:val="0"/>
+          <w:sz w:val="24"/>
+          <w:u w:val="none"/>
+          <w:rtl/>
+          <w:szCs w:val="24"/>
+        </w:rPr>
+        <w:t xml:space="preserve"> לחודש, ולכן יש להפחיתו ל-</w:t>
+      </w:r>
+      <w:r>
+        <w:rPr>
+          <w:b/>
+          <w:sz w:val="24"/>
+          <w:u w:val="none"/>
+          <w:rtl/>
+          <w:bCs/>
+          <w:szCs w:val="24"/>
+        </w:rPr>
+        <w:t>400 ש"ח</w:t>
+      </w:r>
+      <w:r>
+        <w:rPr>
+          <w:b w:val="0"/>
+          <w:sz w:val="24"/>
+          <w:u w:val="none"/>
+          <w:rtl/>
+          <w:szCs w:val="24"/>
+        </w:rPr>
+        <w:t xml:space="preserve">, קרי הפחתה בסך </w:t>
+      </w:r>
+      <w:r>
+        <w:rPr>
+          <w:b/>
+          <w:sz w:val="24"/>
+          <w:u w:val="none"/>
+          <w:rtl/>
+          <w:bCs/>
+          <w:szCs w:val="24"/>
+        </w:rPr>
+        <w:t>800 ש"ח</w:t>
+      </w:r>
+      <w:r>
+        <w:rPr>
+          <w:b w:val="0"/>
+          <w:sz w:val="24"/>
+          <w:u w:val="none"/>
+          <w:rtl/>
+          <w:szCs w:val="24"/>
+        </w:rPr>
+        <w:t xml:space="preserve">. משכך, החל מחודש ספטמבר 2026 יעמוד התשלום החודשי על </w:t>
+      </w:r>
+      <w:r>
+        <w:rPr>
+          <w:b/>
+          <w:sz w:val="24"/>
+          <w:u w:val="none"/>
+          <w:rtl/>
+          <w:bCs/>
+          <w:szCs w:val="24"/>
+        </w:rPr>
+        <w:t>4,650 ש"ח</w:t>
+      </w:r>
+      <w:r>
+        <w:rPr>
+          <w:b w:val="0"/>
+          <w:sz w:val="24"/>
+          <w:u w:val="none"/>
+          <w:rtl/>
+          <w:szCs w:val="24"/>
+        </w:rPr>
+        <w:t xml:space="preserve"> במקום 5,450 ש"ח.</w:t>
+      </w:r>
+    </w:p>
+    <w:p>
+      <w:pPr>
+        <w:tabs>
+          <w:tab w:pos="425" w:val="left"/>
+        </w:tabs>
+        <w:bidi/>
+        <w:spacing w:after="200" w:before="0" w:line="360" w:lineRule="auto"/>
+        <w:ind w:right="425" w:hanging="425"/>
+        <w:jc w:val="both"/>
+      </w:pPr>
+      <w:r>
+        <w:rPr>
+          <w:b w:val="0"/>
+          <w:sz w:val="24"/>
+          <w:u w:val="none"/>
+          <w:rtl/>
+          <w:szCs w:val="24"/>
+        </w:rPr>
+        <w:t>14.</w:t>
         <w:tab/>
       </w:r>
       <w:r>
@@ -1167,8 +1357,43 @@
     </w:p>
     <w:p>
       <w:pPr>
+        <w:keepNext/>
+        <w:keepLines/>
+        <w:tabs>
+          <w:tab w:pos="850" w:val="left"/>
+        </w:tabs>
         <w:bidi/>
-        <w:spacing w:after="480" w:before="0" w:line="240" w:lineRule="auto"/>
+        <w:spacing w:after="120" w:before="0" w:line="360" w:lineRule="auto"/>
+        <w:ind w:right="850" w:hanging="425"/>
+        <w:jc w:val="both"/>
+      </w:pPr>
+      <w:r>
+        <w:rPr>
+          <w:b w:val="0"/>
+          <w:sz w:val="24"/>
+          <w:u w:val="none"/>
+          <w:rtl/>
+          <w:szCs w:val="24"/>
+        </w:rPr>
+        <w:t>ה.</w:t>
+        <w:tab/>
+      </w:r>
+      <w:r>
+        <w:rPr>
+          <w:b w:val="0"/>
+          <w:sz w:val="24"/>
+          <w:u w:val="none"/>
+          <w:rtl/>
+          <w:szCs w:val="24"/>
+        </w:rPr>
+        <w:t>להורות על הפחתת המזונות בסך 800 ש"ח לחודש, נוכח הגעת הבת הבכורה לגיל 18, כך שהחל מחודש ספטמבר 2026 יעמוד התשלום החודשי על 4,650 ש"ח.</w:t>
+      </w:r>
+    </w:p>
+    <w:p>
+      <w:pPr>
+        <w:keepNext/>
+        <w:bidi/>
+        <w:spacing w:after="240" w:before="0" w:line="240" w:lineRule="auto"/>
         <w:jc w:val="left"/>
       </w:pPr>
       <w:r>
@@ -1183,6 +1408,7 @@
     </w:p>
     <w:p>
       <w:pPr>
+        <w:keepNext/>
         <w:bidi/>
         <w:spacing w:after="0" w:before="0" w:line="240" w:lineRule="auto"/>
         <w:jc w:val="right"/>
@@ -1233,6 +1459,7 @@
     </w:p>
     <w:p>
       <w:pPr>
+        <w:keepNext/>
         <w:bidi/>
         <w:spacing w:after="0" w:before="0" w:line="240" w:lineRule="auto"/>
         <w:jc w:val="right"/>

</xml_diff>

<commit_message>
Add daughter's enlistment date and pre-enlistment reduction argument
Co-Authored-By: Claude Opus 5.5 <noreply@anthropic.com>
Claude-Session: https://claude.ai/code/session_01Nr8GbKThPagdJhc29mLGFq
</commit_message>
<xml_diff>
--- a/בקשה להבהרת מועד תחילת חיוב - דמי שכירות.docx
+++ b/בקשה להבהרת מועד תחילת חיוב - דמי שכירות.docx
@@ -1076,7 +1076,49 @@
           <w:rtl/>
           <w:szCs w:val="24"/>
         </w:rPr>
-        <w:t>, והיא טרם התגייסה לשירות צבאי או לאומי.</w:t>
+        <w:t xml:space="preserve">, ומועד גיוסה לצה"ל נקבע לחודש </w:t>
+      </w:r>
+      <w:r>
+        <w:rPr>
+          <w:b/>
+          <w:sz w:val="24"/>
+          <w:u w:val="none"/>
+          <w:rtl/>
+          <w:bCs/>
+          <w:szCs w:val="24"/>
+        </w:rPr>
+        <w:t>מרץ 2027</w:t>
+      </w:r>
+      <w:r>
+        <w:rPr>
+          <w:b w:val="0"/>
+          <w:sz w:val="24"/>
+          <w:u w:val="none"/>
+          <w:rtl/>
+          <w:szCs w:val="24"/>
+        </w:rPr>
+        <w:t xml:space="preserve">. העתק ספח תעודת הזהות ואישור מועד הגיוס מצ"ב ומסומנים </w:t>
+      </w:r>
+      <w:r>
+        <w:rPr>
+          <w:b/>
+          <w:sz w:val="24"/>
+          <w:u w:val="none"/>
+          <w:rtl/>
+          <w:bCs/>
+          <w:szCs w:val="24"/>
+        </w:rPr>
+        <w:t>נספח ג'</w:t>
+      </w:r>
+      <w:r>
+        <w:rPr>
+          <w:b w:val="0"/>
+          <w:sz w:val="24"/>
+          <w:u w:val="none"/>
+          <w:rtl/>
+          <w:szCs w:val="24"/>
+        </w:rPr>
+        <w:t>.</w:t>
       </w:r>
     </w:p>
     <w:p>
@@ -1214,6 +1256,38 @@
           <w:szCs w:val="24"/>
         </w:rPr>
         <w:t>14.</w:t>
+        <w:tab/>
+      </w:r>
+      <w:r>
+        <w:rPr>
+          <w:b w:val="0"/>
+          <w:sz w:val="24"/>
+          <w:u w:val="none"/>
+          <w:rtl/>
+          <w:szCs w:val="24"/>
+        </w:rPr>
+        <w:t>אין הצדקה לחייב את המבקש במזונות מלאים בתקופה הקצרה שעד לגיוס. מדובר בבגירה העומדת בפני גיוס במועד ידוע וקרוב, וחלים לגביה אותם שיקולים שביסוד הפחתת המזונות בתקופת השירות. לפיכך, ההפחתה צריכה לחול כבר מהגיעה לגיל 18, ולא רק ממועד הגיוס בפועל.</w:t>
+      </w:r>
+    </w:p>
+    <w:p>
+      <w:pPr>
+        <w:tabs>
+          <w:tab w:pos="425" w:val="left"/>
+        </w:tabs>
+        <w:bidi/>
+        <w:spacing w:after="200" w:before="0" w:line="360" w:lineRule="auto"/>
+        <w:ind w:right="425" w:hanging="425"/>
+        <w:jc w:val="both"/>
+      </w:pPr>
+      <w:r>
+        <w:rPr>
+          <w:b w:val="0"/>
+          <w:sz w:val="24"/>
+          <w:u w:val="none"/>
+          <w:rtl/>
+          <w:szCs w:val="24"/>
+        </w:rPr>
+        <w:t>15.</w:t>
         <w:tab/>
       </w:r>
       <w:r>

</xml_diff>

<commit_message>
Add mutual pension clearinghouse disclosure request and shorten title
Co-Authored-By: Claude Opus 5.5 <noreply@anthropic.com>
Claude-Session: https://claude.ai/code/session_01Nr8GbKThPagdJhc29mLGFq
</commit_message>
<xml_diff>
--- a/בקשה להבהרת מועד תחילת חיוב - דמי שכירות.docx
+++ b/בקשה להבהרת מועד תחילת חיוב - דמי שכירות.docx
@@ -267,7 +267,7 @@
     <w:p>
       <w:pPr>
         <w:bidi/>
-        <w:spacing w:after="80" w:before="0" w:line="240" w:lineRule="auto"/>
+        <w:spacing w:after="120" w:before="0" w:line="240" w:lineRule="auto"/>
         <w:jc w:val="center"/>
       </w:pPr>
       <w:r>
@@ -279,7 +279,7 @@
           <w:bCs/>
           <w:szCs w:val="32"/>
         </w:rPr>
-        <w:t>בקשה דחופה להבהרת מועד תחילת חיוב המבקש בתשלום דמי שכירות</w:t>
+        <w:t>בקשה דחופה להבהרה ולמתן הוראות</w:t>
       </w:r>
     </w:p>
     <w:p>
@@ -291,13 +291,13 @@
       <w:r>
         <w:rPr>
           <w:b/>
-          <w:sz w:val="32"/>
-          <w:u w:val="single"/>
+          <w:sz w:val="24"/>
+          <w:u w:val="none"/>
           <w:rtl/>
           <w:bCs/>
-          <w:szCs w:val="32"/>
+          <w:szCs w:val="24"/>
         </w:rPr>
-        <w:t>לעיכוב הליכי הוצאה לפועל ולהפחתת מזונות</w:t>
+        <w:t>(מועד תחילת החיוב בדמי שכירות; עיכוב הליכי הוצאה לפועל; הפחתת מזונות; מסלקה פנסיונית)</w:t>
       </w:r>
     </w:p>
     <w:p>
@@ -314,7 +314,7 @@
           <w:rtl/>
           <w:szCs w:val="24"/>
         </w:rPr>
-        <w:t>בית הדין הנכבד מתבקש בזאת להבהיר את מועד תחילת החיוב שהוטל על המבקש בתשלום דמי שכירות, להורות על עיכוב הליכי ההוצאה לפועל שנפתחו נגדו, ולהפחית את המזונות נוכח הגעת הבת הבכורה לגיל 18, כמפורט להלן:</w:t>
+        <w:t>בית הדין הנכבד מתבקש בזאת להבהיר את מועד תחילת החיוב שהוטל על המבקש בתשלום דמי שכירות, להורות על עיכוב הליכי ההוצאה לפועל שנפתחו נגדו, להפחית את המזונות נוכח הגעת הבת הבכורה לגיל 18, ולהורות על המצאה הדדית של דוחות מסלקה פנסיונית, כמפורט להלן:</w:t>
       </w:r>
     </w:p>
     <w:p>
@@ -1298,6 +1298,112 @@
           <w:rtl/>
           <w:szCs w:val="24"/>
         </w:rPr>
+        <w:t xml:space="preserve">עניין נוסף הטעון הכרעה: בדיון מיום </w:t>
+      </w:r>
+      <w:r>
+        <w:rPr>
+          <w:b/>
+          <w:sz w:val="24"/>
+          <w:u w:val="none"/>
+          <w:rtl/>
+          <w:bCs/>
+          <w:szCs w:val="24"/>
+        </w:rPr>
+        <w:t>22.6.2026</w:t>
+      </w:r>
+      <w:r>
+        <w:rPr>
+          <w:b w:val="0"/>
+          <w:sz w:val="24"/>
+          <w:u w:val="none"/>
+          <w:rtl/>
+          <w:szCs w:val="24"/>
+        </w:rPr>
+        <w:t xml:space="preserve"> נאמר כי בתוך </w:t>
+      </w:r>
+      <w:r>
+        <w:rPr>
+          <w:b/>
+          <w:sz w:val="24"/>
+          <w:u w:val="none"/>
+          <w:rtl/>
+          <w:bCs/>
+          <w:szCs w:val="24"/>
+        </w:rPr>
+        <w:t>10 ימים</w:t>
+      </w:r>
+      <w:r>
+        <w:rPr>
+          <w:b w:val="0"/>
+          <w:sz w:val="24"/>
+          <w:u w:val="none"/>
+          <w:rtl/>
+          <w:szCs w:val="24"/>
+        </w:rPr>
+        <w:t xml:space="preserve"> יוגשו דוחות מסלקה פנסיונית. המבקש מעוניין בכך ומוכן להעביר את דוח המסלקה שלו, ואולם התובעת אינה מעוניינת להמציא את הדוח שלה.</w:t>
+      </w:r>
+    </w:p>
+    <w:p>
+      <w:pPr>
+        <w:tabs>
+          <w:tab w:pos="425" w:val="left"/>
+        </w:tabs>
+        <w:bidi/>
+        <w:spacing w:after="200" w:before="0" w:line="360" w:lineRule="auto"/>
+        <w:ind w:right="425" w:hanging="425"/>
+        <w:jc w:val="both"/>
+      </w:pPr>
+      <w:r>
+        <w:rPr>
+          <w:b w:val="0"/>
+          <w:sz w:val="24"/>
+          <w:u w:val="none"/>
+          <w:rtl/>
+          <w:szCs w:val="24"/>
+        </w:rPr>
+        <w:t>16.</w:t>
+        <w:tab/>
+      </w:r>
+      <w:r>
+        <w:rPr>
+          <w:b w:val="0"/>
+          <w:sz w:val="24"/>
+          <w:u w:val="none"/>
+          <w:rtl/>
+          <w:szCs w:val="24"/>
+        </w:rPr>
+        <w:t>זכויות הפנסיה של שני הצדדים שנצברו במהלך הנישואין הן חלק מהנכסים הטעונים איזון, ואי אפשר לערוך איזון הוגן כשרק צד אחד חושף את זכויותיו. המצאה חד צדדית של דוח המסלקה של המבקש בלבד תעניק לתובעת יתרון שאינו מוצדק ותסכל את מטרת ההוראה. משכך, מתבקש בית הדין להורות כי שני הצדדים ימציאו זה לזה את דוחות המסלקה, במקביל ובאותו מועד.</w:t>
+      </w:r>
+    </w:p>
+    <w:p>
+      <w:pPr>
+        <w:tabs>
+          <w:tab w:pos="425" w:val="left"/>
+        </w:tabs>
+        <w:bidi/>
+        <w:spacing w:after="200" w:before="0" w:line="360" w:lineRule="auto"/>
+        <w:ind w:right="425" w:hanging="425"/>
+        <w:jc w:val="both"/>
+      </w:pPr>
+      <w:r>
+        <w:rPr>
+          <w:b w:val="0"/>
+          <w:sz w:val="24"/>
+          <w:u w:val="none"/>
+          <w:rtl/>
+          <w:szCs w:val="24"/>
+        </w:rPr>
+        <w:t>17.</w:t>
+        <w:tab/>
+      </w:r>
+      <w:r>
+        <w:rPr>
+          <w:b w:val="0"/>
+          <w:sz w:val="24"/>
+          <w:u w:val="none"/>
+          <w:rtl/>
+          <w:szCs w:val="24"/>
+        </w:rPr>
         <w:t>אשר על כן, מתבקש בית הדין הנכבד ליתן החלטה בהקדם, כדלקמן:</w:t>
       </w:r>
     </w:p>
@@ -1431,8 +1537,6 @@
     </w:p>
     <w:p>
       <w:pPr>
-        <w:keepNext/>
-        <w:keepLines/>
         <w:tabs>
           <w:tab w:pos="850" w:val="left"/>
         </w:tabs>
@@ -1461,6 +1565,40 @@
           <w:szCs w:val="24"/>
         </w:rPr>
         <w:t>להורות על הפחתת המזונות בסך 800 ש"ח לחודש, נוכח הגעת הבת הבכורה לגיל 18, כך שהחל מחודש ספטמבר 2026 יעמוד התשלום החודשי על 4,650 ש"ח.</w:t>
+      </w:r>
+    </w:p>
+    <w:p>
+      <w:pPr>
+        <w:keepNext/>
+        <w:keepLines/>
+        <w:tabs>
+          <w:tab w:pos="850" w:val="left"/>
+        </w:tabs>
+        <w:bidi/>
+        <w:spacing w:after="120" w:before="0" w:line="360" w:lineRule="auto"/>
+        <w:ind w:right="850" w:hanging="425"/>
+        <w:jc w:val="both"/>
+      </w:pPr>
+      <w:r>
+        <w:rPr>
+          <w:b w:val="0"/>
+          <w:sz w:val="24"/>
+          <w:u w:val="none"/>
+          <w:rtl/>
+          <w:szCs w:val="24"/>
+        </w:rPr>
+        <w:t>ו.</w:t>
+        <w:tab/>
+      </w:r>
+      <w:r>
+        <w:rPr>
+          <w:b w:val="0"/>
+          <w:sz w:val="24"/>
+          <w:u w:val="none"/>
+          <w:rtl/>
+          <w:szCs w:val="24"/>
+        </w:rPr>
+        <w:t>להורות לשני הצדדים להמציא זה לזה, במקביל ובתוך 10 ימים ממתן ההחלטה, דוח מסלקה פנסיונית עדכני, ולא למבקש בלבד.</w:t>
       </w:r>
     </w:p>
     <w:p>

</xml_diff>

<commit_message>
Cite protocol line 107 on pension clearinghouse commitment
Co-Authored-By: Claude Opus 5.5 <noreply@anthropic.com>
Claude-Session: https://claude.ai/code/session_01Nr8GbKThPagdJhc29mLGFq
</commit_message>
<xml_diff>
--- a/בקשה להבהרת מועד תחילת חיוב - דמי שכירות.docx
+++ b/בקשה להבהרת מועד תחילת חיוב - דמי שכירות.docx
@@ -1319,7 +1319,7 @@
           <w:rtl/>
           <w:szCs w:val="24"/>
         </w:rPr>
-        <w:t xml:space="preserve"> נאמר כי בתוך </w:t>
+        <w:t xml:space="preserve"> הצהירה ב"כ התובעת עצמה, כמתועד בשורה 107 לפרוטוקול, כי </w:t>
       </w:r>
       <w:r>
         <w:rPr>
@@ -1330,7 +1330,7 @@
           <w:bCs/>
           <w:szCs w:val="24"/>
         </w:rPr>
-        <w:t>10 ימים</w:t>
+        <w:t>"תוך עשרה ימים יגישו מסלקה פנסיונית"</w:t>
       </w:r>
       <w:r>
         <w:rPr>
@@ -1340,7 +1340,28 @@
           <w:rtl/>
           <w:szCs w:val="24"/>
         </w:rPr>
-        <w:t xml:space="preserve"> יוגשו דוחות מסלקה פנסיונית. המבקש מעוניין בכך ומוכן להעביר את דוח המסלקה שלו, ואולם התובעת אינה מעוניינת להמציא את הדוח שלה.</w:t>
+        <w:t xml:space="preserve">. העתק הפרוטוקול מצ"ב ומסומן </w:t>
+      </w:r>
+      <w:r>
+        <w:rPr>
+          <w:b/>
+          <w:sz w:val="24"/>
+          <w:u w:val="none"/>
+          <w:rtl/>
+          <w:bCs/>
+          <w:szCs w:val="24"/>
+        </w:rPr>
+        <w:t>נספח ד'</w:t>
+      </w:r>
+      <w:r>
+        <w:rPr>
+          <w:b w:val="0"/>
+          <w:sz w:val="24"/>
+          <w:u w:val="none"/>
+          <w:rtl/>
+          <w:szCs w:val="24"/>
+        </w:rPr>
+        <w:t>.</w:t>
       </w:r>
     </w:p>
     <w:p>
@@ -1372,6 +1393,38 @@
           <w:rtl/>
           <w:szCs w:val="24"/>
         </w:rPr>
+        <w:t>ההצהרה נאמרה בלשון רבים ומפי ב"כ התובעת, ומשכך אין לפרשה כהתחייבות של המבקש בלבד. המועד שנקבע חלף זה מכבר, והמבקש מעוניין ומוכן להעביר את דוח המסלקה שלו. אולם התובעת, שבאת כוחה היא שהציעה את ההגשה, אינה מעוניינת כיום להמציא את הדוח שלה. התנהלות זו אינה עולה בקנה אחד עם ההצהרה שנמסרה בשמה בפני בית הדין.</w:t>
+      </w:r>
+    </w:p>
+    <w:p>
+      <w:pPr>
+        <w:tabs>
+          <w:tab w:pos="425" w:val="left"/>
+        </w:tabs>
+        <w:bidi/>
+        <w:spacing w:after="200" w:before="0" w:line="360" w:lineRule="auto"/>
+        <w:ind w:right="425" w:hanging="425"/>
+        <w:jc w:val="both"/>
+      </w:pPr>
+      <w:r>
+        <w:rPr>
+          <w:b w:val="0"/>
+          <w:sz w:val="24"/>
+          <w:u w:val="none"/>
+          <w:rtl/>
+          <w:szCs w:val="24"/>
+        </w:rPr>
+        <w:t>17.</w:t>
+        <w:tab/>
+      </w:r>
+      <w:r>
+        <w:rPr>
+          <w:b w:val="0"/>
+          <w:sz w:val="24"/>
+          <w:u w:val="none"/>
+          <w:rtl/>
+          <w:szCs w:val="24"/>
+        </w:rPr>
         <w:t>זכויות הפנסיה של שני הצדדים שנצברו במהלך הנישואין הן חלק מהנכסים הטעונים איזון, ואי אפשר לערוך איזון הוגן כשרק צד אחד חושף את זכויותיו. המצאה חד צדדית של דוח המסלקה של המבקש בלבד תעניק לתובעת יתרון שאינו מוצדק ותסכל את מטרת ההוראה. משכך, מתבקש בית הדין להורות כי שני הצדדים ימציאו זה לזה את דוחות המסלקה, במקביל ובאותו מועד.</w:t>
       </w:r>
     </w:p>
@@ -1393,7 +1446,7 @@
           <w:rtl/>
           <w:szCs w:val="24"/>
         </w:rPr>
-        <w:t>17.</w:t>
+        <w:t>18.</w:t>
         <w:tab/>
       </w:r>
       <w:r>

</xml_diff>